<commit_message>
Shot list: self-describing filenames (song-code-what-cast), PDF for the stage manager
Naming is now S<song>-<code>-<what>-<CAST>.<ext> so a filename says
where it plays, what it is, and which couple. L5Y-Shot-List.pdf is
rendered from shotlist.json via headless Chromium alongside the MD and
DOCX; ASSETS.md now points at the shot list as the source of truth.

Co-Authored-By: Claude Fable 5.1 <noreply@anthropic.com>
Claude-Session: https://claude.ai/code/session_01Y6sUkZbYffNPeDjzCChZiy
</commit_message>
<xml_diff>
--- a/L5Y-Shot-List.docx
+++ b/L5Y-Shot-List.docx
@@ -93,7 +93,7 @@
           <w:szCs w:val="18"/>
           <w:rFonts w:ascii="Georgia" w:cs="Georgia" w:eastAsia="Georgia" w:hAnsi="Georgia"/>
         </w:rPr>
-        <w:t xml:space="preserve">Name every file by its asset code, then the cast suffix: -ml (Maegan &amp; Landon) or -ac (Andrew &amp; Charlie). Assets marked SHARED need no suffix — one file serves both casts.</w:t>
+        <w:t xml:space="preserve">Every filename says WHERE it plays, WHAT it is, and WHICH CAST, in this order:  S&lt;song&gt;-&lt;code&gt;-&lt;what&gt;-&lt;CAST&gt;.&lt;ext&gt;   The cast tag is ML (Maegan &amp; Landon), AC (Andrew &amp; Charlie), or SHARED (one file serves both casts). The code (M1, M7b, V2…) is the part the system reads — never change it; the rest is for humans.</w:t>
       </w:r>
     </w:p>
     <w:p>
@@ -118,7 +118,7 @@
           <w:szCs w:val="18"/>
           <w:rFonts w:ascii="Georgia" w:cs="Georgia" w:eastAsia="Georgia" w:hAnsi="Georgia"/>
         </w:rPr>
-        <w:t xml:space="preserve">M1-ml.jpg   M1-ac.jpg   M12.jpg   V2-ml.mp4   V2-ac.mp4   A1-ml.m4a</w:t>
+        <w:t xml:space="preserve">S03-M1-pier-golden-hour-ML.jpg   S03-M1-pier-golden-hour-AC.jpg   S05-M12-dedication-for-cathy-SHARED.jpg   S07-V2-facetime-jamie-desk-ML.mp4   S07-V2-facetime-jamie-desk-AC.mp4</w:t>
       </w:r>
     </w:p>
     <w:p>
@@ -168,7 +168,7 @@
           <w:szCs w:val="18"/>
           <w:rFonts w:ascii="Georgia" w:cs="Georgia" w:eastAsia="Georgia" w:hAnsi="Georgia"/>
         </w:rPr>
-        <w:t xml:space="preserve">MP4 (H.264), 1920×1080, landscape. Videos exceed the Drive transfer limit — upload V2 to the GitHub repo (Add file → Upload files, into assets/) or hand it to the show laptop; tell me which.</w:t>
+        <w:t xml:space="preserve">MP4 (H.264), 1920×1080 landscape. The video is larger than the Drive transfer limit: upload it to the GitHub repo (Add file → Upload files, into assets/) or give it to the show laptop — tell me which.</w:t>
       </w:r>
     </w:p>
     <w:p>
@@ -218,7 +218,7 @@
           <w:szCs w:val="18"/>
           <w:rFonts w:ascii="Georgia" w:cs="Georgia" w:eastAsia="Georgia" w:hAnsi="Georgia"/>
         </w:rPr>
-        <w:t xml:space="preserve">One Drive folder, flat, e.g. “L5Y Assets” — tell me when it's there. Missing files are fine: a code that has no file keeps its placeholder, so partial uploads never break the show.</w:t>
+        <w:t xml:space="preserve">One Google Drive folder named  L5Y ASSETS , files flat inside it (no subfolders). Tell me when files land — I pull them and place every one by its code. A missing file keeps its placeholder, so partial uploads never break the show.</w:t>
       </w:r>
     </w:p>
     <w:p>
@@ -509,7 +509,7 @@
                 <w:szCs w:val="14"/>
                 <w:rFonts w:ascii="Courier New" w:cs="Courier New" w:eastAsia="Courier New" w:hAnsi="Courier New"/>
               </w:rPr>
-              <w:t xml:space="preserve">M24-ml.jpg</w:t>
+              <w:t xml:space="preserve">S01-M24-cathy-wallpaper-jamie-ML.jpg</w:t>
             </w:r>
           </w:p>
           <w:p>
@@ -522,7 +522,7 @@
                 <w:szCs w:val="14"/>
                 <w:rFonts w:ascii="Courier New" w:cs="Courier New" w:eastAsia="Courier New" w:hAnsi="Courier New"/>
               </w:rPr>
-              <w:t xml:space="preserve">M24-ac.jpg</w:t>
+              <w:t xml:space="preserve">S01-M24-cathy-wallpaper-jamie-AC.jpg</w:t>
             </w:r>
           </w:p>
         </w:tc>
@@ -716,7 +716,7 @@
                 <w:szCs w:val="14"/>
                 <w:rFonts w:ascii="Courier New" w:cs="Courier New" w:eastAsia="Courier New" w:hAnsi="Courier New"/>
               </w:rPr>
-              <w:t xml:space="preserve">M15-ml.jpg</w:t>
+              <w:t xml:space="preserve">S01-M15-the-couch-nine-months-ML.jpg</w:t>
             </w:r>
           </w:p>
           <w:p>
@@ -729,7 +729,7 @@
                 <w:szCs w:val="14"/>
                 <w:rFonts w:ascii="Courier New" w:cs="Courier New" w:eastAsia="Courier New" w:hAnsi="Courier New"/>
               </w:rPr>
-              <w:t xml:space="preserve">M15-ac.jpg</w:t>
+              <w:t xml:space="preserve">S01-M15-the-couch-nine-months-AC.jpg</w:t>
             </w:r>
           </w:p>
         </w:tc>
@@ -923,7 +923,7 @@
                 <w:szCs w:val="14"/>
                 <w:rFonts w:ascii="Courier New" w:cs="Courier New" w:eastAsia="Courier New" w:hAnsi="Courier New"/>
               </w:rPr>
-              <w:t xml:space="preserve">M3a-ml.jpg</w:t>
+              <w:t xml:space="preserve">S01-M3a-ring-rowboat-ML.jpg</w:t>
             </w:r>
           </w:p>
           <w:p>
@@ -936,7 +936,7 @@
                 <w:szCs w:val="14"/>
                 <w:rFonts w:ascii="Courier New" w:cs="Courier New" w:eastAsia="Courier New" w:hAnsi="Courier New"/>
               </w:rPr>
-              <w:t xml:space="preserve">M3a-ac.jpg</w:t>
+              <w:t xml:space="preserve">S01-M3a-ring-rowboat-AC.jpg</w:t>
             </w:r>
           </w:p>
         </w:tc>
@@ -1130,7 +1130,7 @@
                 <w:szCs w:val="14"/>
                 <w:rFonts w:ascii="Courier New" w:cs="Courier New" w:eastAsia="Courier New" w:hAnsi="Courier New"/>
               </w:rPr>
-              <w:t xml:space="preserve">M2-ml.jpg</w:t>
+              <w:t xml:space="preserve">S01-M2-ohio-cast-day-one-ML.jpg</w:t>
             </w:r>
           </w:p>
           <w:p>
@@ -1143,7 +1143,7 @@
                 <w:szCs w:val="14"/>
                 <w:rFonts w:ascii="Courier New" w:cs="Courier New" w:eastAsia="Courier New" w:hAnsi="Courier New"/>
               </w:rPr>
-              <w:t xml:space="preserve">M2-ac.jpg</w:t>
+              <w:t xml:space="preserve">S01-M2-ohio-cast-day-one-AC.jpg</w:t>
             </w:r>
           </w:p>
         </w:tc>
@@ -1337,7 +1337,7 @@
                 <w:szCs w:val="14"/>
                 <w:rFonts w:ascii="Courier New" w:cs="Courier New" w:eastAsia="Courier New" w:hAnsi="Courier New"/>
               </w:rPr>
-              <w:t xml:space="preserve">M4-ml.jpg</w:t>
+              <w:t xml:space="preserve">S01-M4-wedding-portrait-ML.jpg</w:t>
             </w:r>
           </w:p>
           <w:p>
@@ -1350,7 +1350,7 @@
                 <w:szCs w:val="14"/>
                 <w:rFonts w:ascii="Courier New" w:cs="Courier New" w:eastAsia="Courier New" w:hAnsi="Courier New"/>
               </w:rPr>
-              <w:t xml:space="preserve">M4-ac.jpg</w:t>
+              <w:t xml:space="preserve">S01-M4-wedding-portrait-AC.jpg</w:t>
             </w:r>
           </w:p>
         </w:tc>
@@ -1544,7 +1544,7 @@
                 <w:szCs w:val="14"/>
                 <w:rFonts w:ascii="Courier New" w:cs="Courier New" w:eastAsia="Courier New" w:hAnsi="Courier New"/>
               </w:rPr>
-              <w:t xml:space="preserve">M1-ml.jpg</w:t>
+              <w:t xml:space="preserve">S03-M1-pier-golden-hour-ML.jpg</w:t>
             </w:r>
           </w:p>
           <w:p>
@@ -1557,7 +1557,7 @@
                 <w:szCs w:val="14"/>
                 <w:rFonts w:ascii="Courier New" w:cs="Courier New" w:eastAsia="Courier New" w:hAnsi="Courier New"/>
               </w:rPr>
-              <w:t xml:space="preserve">M1-ac.jpg</w:t>
+              <w:t xml:space="preserve">S03-M1-pier-golden-hour-AC.jpg</w:t>
             </w:r>
           </w:p>
         </w:tc>
@@ -1751,7 +1751,7 @@
                 <w:szCs w:val="14"/>
                 <w:rFonts w:ascii="Courier New" w:cs="Courier New" w:eastAsia="Courier New" w:hAnsi="Courier New"/>
               </w:rPr>
-              <w:t xml:space="preserve">M7-ml.jpg</w:t>
+              <w:t xml:space="preserve">S05-M7-party-cathy-at-edge-ML.jpg</w:t>
             </w:r>
           </w:p>
           <w:p>
@@ -1764,7 +1764,7 @@
                 <w:szCs w:val="14"/>
                 <w:rFonts w:ascii="Courier New" w:cs="Courier New" w:eastAsia="Courier New" w:hAnsi="Courier New"/>
               </w:rPr>
-              <w:t xml:space="preserve">M7-ac.jpg</w:t>
+              <w:t xml:space="preserve">S05-M7-party-cathy-at-edge-AC.jpg</w:t>
             </w:r>
           </w:p>
         </w:tc>
@@ -1958,7 +1958,7 @@
                 <w:szCs w:val="14"/>
                 <w:rFonts w:ascii="Courier New" w:cs="Courier New" w:eastAsia="Courier New" w:hAnsi="Courier New"/>
               </w:rPr>
-              <w:t xml:space="preserve">M12.jpg  (one file, both casts)</w:t>
+              <w:t xml:space="preserve">S05-M12-dedication-for-cathy-SHARED.jpg</w:t>
             </w:r>
           </w:p>
         </w:tc>
@@ -2152,7 +2152,7 @@
                 <w:szCs w:val="14"/>
                 <w:rFonts w:ascii="Courier New" w:cs="Courier New" w:eastAsia="Courier New" w:hAnsi="Courier New"/>
               </w:rPr>
-              <w:t xml:space="preserve">M23.jpg  (one file, both casts)</w:t>
+              <w:t xml:space="preserve">S06-M23-christmas-wallpaper-SHARED.jpg</w:t>
             </w:r>
           </w:p>
         </w:tc>
@@ -2346,7 +2346,7 @@
                 <w:szCs w:val="14"/>
                 <w:rFonts w:ascii="Courier New" w:cs="Courier New" w:eastAsia="Courier New" w:hAnsi="Courier New"/>
               </w:rPr>
-              <w:t xml:space="preserve">V2-ml.mp4</w:t>
+              <w:t xml:space="preserve">S07-V2-facetime-jamie-desk-ML.mp4</w:t>
             </w:r>
           </w:p>
           <w:p>
@@ -2359,7 +2359,7 @@
                 <w:szCs w:val="14"/>
                 <w:rFonts w:ascii="Courier New" w:cs="Courier New" w:eastAsia="Courier New" w:hAnsi="Courier New"/>
               </w:rPr>
-              <w:t xml:space="preserve">V2-ac.mp4</w:t>
+              <w:t xml:space="preserve">S07-V2-facetime-jamie-desk-AC.mp4</w:t>
             </w:r>
           </w:p>
         </w:tc>
@@ -3235,7 +3235,7 @@
                 <w:szCs w:val="14"/>
                 <w:rFonts w:ascii="Courier New" w:cs="Courier New" w:eastAsia="Courier New" w:hAnsi="Courier New"/>
               </w:rPr>
-              <w:t xml:space="preserve">A1-ml.m4a</w:t>
+              <w:t xml:space="preserve">S14-A1-cathy-voicemail-ML.m4a</w:t>
             </w:r>
           </w:p>
           <w:p>
@@ -3248,7 +3248,7 @@
                 <w:szCs w:val="14"/>
                 <w:rFonts w:ascii="Courier New" w:cs="Courier New" w:eastAsia="Courier New" w:hAnsi="Courier New"/>
               </w:rPr>
-              <w:t xml:space="preserve">A1-ac.m4a</w:t>
+              <w:t xml:space="preserve">S14-A1-cathy-voicemail-AC.m4a</w:t>
             </w:r>
           </w:p>
         </w:tc>
@@ -3442,7 +3442,7 @@
                 <w:szCs w:val="14"/>
                 <w:rFonts w:ascii="Courier New" w:cs="Courier New" w:eastAsia="Courier New" w:hAnsi="Courier New"/>
               </w:rPr>
-              <w:t xml:space="preserve">M8-ml.jpg</w:t>
+              <w:t xml:space="preserve">S10-M8-bar-celebration-ML.jpg</w:t>
             </w:r>
           </w:p>
           <w:p>
@@ -3455,7 +3455,7 @@
                 <w:szCs w:val="14"/>
                 <w:rFonts w:ascii="Courier New" w:cs="Courier New" w:eastAsia="Courier New" w:hAnsi="Courier New"/>
               </w:rPr>
-              <w:t xml:space="preserve">M8-ac.jpg</w:t>
+              <w:t xml:space="preserve">S10-M8-bar-celebration-AC.jpg</w:t>
             </w:r>
           </w:p>
         </w:tc>
@@ -3649,7 +3649,7 @@
                 <w:szCs w:val="14"/>
                 <w:rFonts w:ascii="Courier New" w:cs="Courier New" w:eastAsia="Courier New" w:hAnsi="Courier New"/>
               </w:rPr>
-              <w:t xml:space="preserve">M11a-ml.jpg</w:t>
+              <w:t xml:space="preserve">S12-M11a-carolann-wedding-ML.jpg</w:t>
             </w:r>
           </w:p>
           <w:p>
@@ -3662,7 +3662,7 @@
                 <w:szCs w:val="14"/>
                 <w:rFonts w:ascii="Courier New" w:cs="Courier New" w:eastAsia="Courier New" w:hAnsi="Courier New"/>
               </w:rPr>
-              <w:t xml:space="preserve">M11a-ac.jpg</w:t>
+              <w:t xml:space="preserve">S12-M11a-carolann-wedding-AC.jpg</w:t>
             </w:r>
           </w:p>
         </w:tc>
@@ -3856,7 +3856,7 @@
                 <w:szCs w:val="14"/>
                 <w:rFonts w:ascii="Courier New" w:cs="Courier New" w:eastAsia="Courier New" w:hAnsi="Courier New"/>
               </w:rPr>
-              <w:t xml:space="preserve">M11b-ml.jpg</w:t>
+              <w:t xml:space="preserve">S12-M11b-carolann-baby-ML.jpg</w:t>
             </w:r>
           </w:p>
           <w:p>
@@ -3869,7 +3869,7 @@
                 <w:szCs w:val="14"/>
                 <w:rFonts w:ascii="Courier New" w:cs="Courier New" w:eastAsia="Courier New" w:hAnsi="Courier New"/>
               </w:rPr>
-              <w:t xml:space="preserve">M11b-ac.jpg</w:t>
+              <w:t xml:space="preserve">S12-M11b-carolann-baby-AC.jpg</w:t>
             </w:r>
           </w:p>
         </w:tc>
@@ -4063,7 +4063,7 @@
                 <w:szCs w:val="14"/>
                 <w:rFonts w:ascii="Courier New" w:cs="Courier New" w:eastAsia="Courier New" w:hAnsi="Courier New"/>
               </w:rPr>
-              <w:t xml:space="preserve">M11c-ml.jpg</w:t>
+              <w:t xml:space="preserve">S12-M11c-carolann-house-ML.jpg</w:t>
             </w:r>
           </w:p>
           <w:p>
@@ -4076,7 +4076,7 @@
                 <w:szCs w:val="14"/>
                 <w:rFonts w:ascii="Courier New" w:cs="Courier New" w:eastAsia="Courier New" w:hAnsi="Courier New"/>
               </w:rPr>
-              <w:t xml:space="preserve">M11c-ac.jpg</w:t>
+              <w:t xml:space="preserve">S12-M11c-carolann-house-AC.jpg</w:t>
             </w:r>
           </w:p>
         </w:tc>

</xml_diff>